<commit_message>
Update 58 files: CVSalama.pdf, CTO & IT Director - Mahmoud Salama - Cover Letter - FINAL FROZEN.docx, CTO & IT Director - Mahmoud Salama - Cover Letter - FINAL FROZEN.pdf, Digital Transformation Director - Mahmoud Salama - Cover Letter - FINAL FROZEN.docx, ...omitted 54 file(s)
</commit_message>
<xml_diff>
--- a/docs/cvs/CTO & IT Director - Mahmoud Salama - FINAL FROZEN.docx
+++ b/docs/cvs/CTO & IT Director - Mahmoud Salama - FINAL FROZEN.docx
@@ -4,53 +4,50 @@
   <w:body>
     <w:p>
       <w:pPr>
-        <w:keepNext/>
-        <w:spacing w:before="0" w:after="40" w:line="245" w:lineRule="auto"/>
-        <w:jc w:val="left"/>
-        <w:pBdr>
-          <w:top w:val="single" w:sz="16" w:space="2" w:color="C49A45"/>
-        </w:pBdr>
+        <w:keepNext w:val="0"/>
+        <w:pageBreakBefore w:val="0"/>
+        <w:spacing w:before="0" w:after="10" w:line="240" w:lineRule="auto"/>
+        <w:jc w:val="center"/>
       </w:pPr>
       <w:r>
         <w:rPr>
-          <w:rFonts w:ascii="Aptos Display" w:hAnsi="Aptos Display" w:eastAsia="Arial"/>
+          <w:rFonts w:ascii="Arial" w:hAnsi="Arial" w:eastAsia="Arial"/>
           <w:b/>
-          <w:color w:val="17324D"/>
-          <w:sz w:val="44"/>
+          <w:color w:val="183B56"/>
+          <w:sz w:val="40"/>
         </w:rPr>
         <w:t>MAHMOUD SALAMA</w:t>
       </w:r>
     </w:p>
     <w:p>
       <w:pPr>
-        <w:keepNext/>
-        <w:spacing w:before="0" w:after="40" w:line="245" w:lineRule="auto"/>
+        <w:keepNext w:val="0"/>
+        <w:pageBreakBefore w:val="0"/>
+        <w:spacing w:before="0" w:after="36" w:line="240" w:lineRule="auto"/>
         <w:jc w:val="center"/>
       </w:pPr>
       <w:r>
         <w:rPr>
-          <w:rFonts w:ascii="Aptos Display" w:hAnsi="Aptos Display" w:eastAsia="Arial"/>
+          <w:rFonts w:ascii="Arial" w:hAnsi="Arial" w:eastAsia="Arial"/>
           <w:b/>
-          <w:color w:val="17324D"/>
-          <w:sz w:val="25"/>
+          <w:color w:val="183B56"/>
+          <w:sz w:val="21"/>
         </w:rPr>
         <w:t>CTO / IT DIRECTOR | TECHNOLOGY STRATEGY, ENTERPRISE SYSTEMS &amp; DIGITAL OPERATIONS</w:t>
       </w:r>
     </w:p>
     <w:p>
       <w:pPr>
-        <w:keepNext/>
-        <w:spacing w:before="0" w:after="40" w:line="245" w:lineRule="auto"/>
+        <w:keepNext w:val="0"/>
+        <w:pageBreakBefore w:val="0"/>
+        <w:spacing w:before="0" w:after="25" w:line="240" w:lineRule="auto"/>
         <w:jc w:val="center"/>
-        <w:pBdr>
-          <w:bottom w:val="single" w:sz="8" w:space="5" w:color="17324D"/>
-        </w:pBdr>
       </w:pPr>
       <w:r>
         <w:rPr>
           <w:rFonts w:ascii="Arial" w:hAnsi="Arial" w:eastAsia="Arial"/>
-          <w:b/>
-          <w:color w:val="C49A45"/>
+          <w:b w:val="0"/>
+          <w:color w:val="5D6974"/>
           <w:sz w:val="16"/>
         </w:rPr>
         <w:t>Technology Strategy | IT Operating Model | Enterprise Architecture | Applications, Data, Risk, Continuity &amp; Third-Party Coordination</w:t>
@@ -58,29 +55,36 @@
     </w:p>
     <w:p>
       <w:pPr>
-        <w:spacing w:before="0" w:after="40" w:line="245" w:lineRule="auto"/>
+        <w:keepNext w:val="0"/>
+        <w:pageBreakBefore w:val="0"/>
+        <w:spacing w:before="0" w:after="25" w:line="240" w:lineRule="auto"/>
         <w:jc w:val="center"/>
       </w:pPr>
       <w:r>
         <w:rPr>
           <w:rFonts w:ascii="Arial" w:hAnsi="Arial" w:eastAsia="Arial"/>
           <w:b w:val="0"/>
-          <w:color w:val="53616A"/>
-          <w:sz w:val="15"/>
+          <w:color w:val="5D6974"/>
+          <w:sz w:val="16"/>
         </w:rPr>
         <w:t>+20 122 015 6077 | ma7moud.salamaaa@gmail.com | Cairo, Egypt</w:t>
       </w:r>
     </w:p>
     <w:p>
       <w:pPr>
-        <w:spacing w:before="0" w:after="40" w:line="245" w:lineRule="auto"/>
+        <w:keepNext w:val="0"/>
+        <w:pageBreakBefore w:val="0"/>
+        <w:spacing w:before="0" w:after="72" w:line="240" w:lineRule="auto"/>
         <w:jc w:val="center"/>
+        <w:pBdr>
+          <w:bottom w:val="single" w:sz="9" w:space="3" w:color="173B57"/>
+        </w:pBdr>
       </w:pPr>
       <w:r>
         <w:rPr>
           <w:rFonts w:ascii="Arial" w:hAnsi="Arial" w:eastAsia="Arial"/>
           <w:b w:val="0"/>
-          <w:color w:val="5A6570"/>
+          <w:color w:val="5D6974"/>
           <w:sz w:val="16"/>
         </w:rPr>
         <w:t>linkedin.com/in/mahmoud-salama-30249b34 | mahmoud-salama.vercel.app</w:t>
@@ -89,32 +93,34 @@
     <w:p>
       <w:pPr>
         <w:keepNext/>
-        <w:spacing w:before="120" w:after="40" w:line="245" w:lineRule="auto"/>
+        <w:spacing w:before="88" w:after="60" w:line="240" w:lineRule="auto"/>
+        <w:pageBreakBefore w:val="0"/>
         <w:pBdr>
-          <w:bottom w:val="single" w:sz="7" w:space="3" w:color="C49A45"/>
+          <w:bottom w:val="single" w:sz="5" w:space="3" w:color="B8C5D1"/>
         </w:pBdr>
-        <w:keepLines/>
       </w:pPr>
       <w:r>
         <w:rPr>
-          <w:rFonts w:ascii="Aptos Display" w:hAnsi="Aptos Display" w:eastAsia="Arial"/>
+          <w:rFonts w:ascii="Arial" w:hAnsi="Arial" w:eastAsia="Arial"/>
           <w:b/>
-          <w:color w:val="17324D"/>
-          <w:sz w:val="18"/>
+          <w:color w:val="183B56"/>
+          <w:sz w:val="19"/>
         </w:rPr>
         <w:t>PROFESSIONAL PROFILE</w:t>
       </w:r>
     </w:p>
     <w:p>
       <w:pPr>
-        <w:spacing w:before="0" w:after="40" w:line="245" w:lineRule="auto"/>
+        <w:keepNext w:val="0"/>
+        <w:pageBreakBefore w:val="0"/>
+        <w:spacing w:before="0" w:after="41" w:line="240" w:lineRule="auto"/>
       </w:pPr>
       <w:r>
         <w:rPr>
           <w:rFonts w:ascii="Arial" w:hAnsi="Arial" w:eastAsia="Arial"/>
           <w:i w:val="0"/>
           <w:color w:val="111111"/>
-          <w:sz w:val="16"/>
+          <w:sz w:val="17"/>
         </w:rPr>
         <w:t>Technology executive and software-engineering leader with 18+ years of experience spanning hands-on C#/.NET development, enterprise applications, solution and enterprise architecture, digital transformation, information-systems leadership, and large-scale service delivery across Egypt and the GCC. Leads a 54-person technology organization across four major functions with seven direct reports. Combines engineering depth with operating-model design, portfolio governance and third-party coordination, modernization, data and integration, service operations, risk/continuity oversight, and executive stakeholder leadership.</w:t>
       </w:r>
@@ -122,32 +128,34 @@
     <w:p>
       <w:pPr>
         <w:keepNext/>
-        <w:spacing w:before="120" w:after="40" w:line="245" w:lineRule="auto"/>
+        <w:spacing w:before="88" w:after="60" w:line="240" w:lineRule="auto"/>
+        <w:pageBreakBefore w:val="0"/>
         <w:pBdr>
-          <w:bottom w:val="single" w:sz="7" w:space="3" w:color="C49A45"/>
+          <w:bottom w:val="single" w:sz="5" w:space="3" w:color="B8C5D1"/>
         </w:pBdr>
-        <w:keepLines/>
       </w:pPr>
       <w:r>
         <w:rPr>
-          <w:rFonts w:ascii="Aptos Display" w:hAnsi="Aptos Display" w:eastAsia="Arial"/>
+          <w:rFonts w:ascii="Arial" w:hAnsi="Arial" w:eastAsia="Arial"/>
           <w:b/>
-          <w:color w:val="17324D"/>
-          <w:sz w:val="18"/>
+          <w:color w:val="183B56"/>
+          <w:sz w:val="19"/>
         </w:rPr>
         <w:t>CORE LEADERSHIP AREAS</w:t>
       </w:r>
     </w:p>
     <w:p>
       <w:pPr>
-        <w:spacing w:before="0" w:after="40" w:line="245" w:lineRule="auto"/>
+        <w:keepNext w:val="0"/>
+        <w:pageBreakBefore w:val="0"/>
+        <w:spacing w:before="0" w:after="41" w:line="240" w:lineRule="auto"/>
       </w:pPr>
       <w:r>
         <w:rPr>
           <w:rFonts w:ascii="Arial" w:hAnsi="Arial" w:eastAsia="Arial"/>
           <w:i w:val="0"/>
           <w:color w:val="123B4A"/>
-          <w:sz w:val="16"/>
+          <w:sz w:val="17"/>
         </w:rPr>
         <w:t>IT &amp; Technology Strategy | Technology Operating Model | Enterprise &amp; Solution Architecture | Portfolio &amp; SDLC Governance | Digital Transformation | Service Operations | Information Security Governance | IT Risk | Technology Vendor Management</w:t>
       </w:r>
@@ -155,124 +163,135 @@
     <w:p>
       <w:pPr>
         <w:keepNext/>
-        <w:spacing w:before="120" w:after="40" w:line="245" w:lineRule="auto"/>
+        <w:spacing w:before="88" w:after="60" w:line="240" w:lineRule="auto"/>
+        <w:pageBreakBefore w:val="0"/>
         <w:pBdr>
-          <w:bottom w:val="single" w:sz="7" w:space="3" w:color="C49A45"/>
+          <w:bottom w:val="single" w:sz="5" w:space="3" w:color="B8C5D1"/>
         </w:pBdr>
-        <w:keepLines/>
       </w:pPr>
       <w:r>
         <w:rPr>
-          <w:rFonts w:ascii="Aptos Display" w:hAnsi="Aptos Display" w:eastAsia="Arial"/>
+          <w:rFonts w:ascii="Arial" w:hAnsi="Arial" w:eastAsia="Arial"/>
           <w:b/>
-          <w:color w:val="17324D"/>
-          <w:sz w:val="18"/>
+          <w:color w:val="183B56"/>
+          <w:sz w:val="19"/>
         </w:rPr>
         <w:t>SELECTED CAREER IMPACT</w:t>
       </w:r>
     </w:p>
     <w:p>
       <w:pPr>
-        <w:spacing w:before="0" w:after="24" w:line="245" w:lineRule="auto"/>
-        <w:ind w:left="202" w:hanging="144"/>
-        <w:keepLines/>
+        <w:keepNext w:val="0"/>
+        <w:pageBreakBefore w:val="0"/>
+        <w:spacing w:before="0" w:after="44" w:line="240" w:lineRule="auto"/>
+        <w:ind w:left="230" w:hanging="158"/>
       </w:pPr>
       <w:r>
         <w:rPr>
           <w:rFonts w:ascii="Arial" w:hAnsi="Arial" w:eastAsia="Arial"/>
-          <w:b/>
-          <w:color w:val="C49A45"/>
-          <w:sz w:val="16"/>
+          <w:b w:val="0"/>
+          <w:color w:val="262F38"/>
+          <w:sz w:val="17"/>
         </w:rPr>
         <w:t>• Lead a 54-person technology organization across four major functions, strengthening architecture, delivery, service governance and executive accountability.</w:t>
       </w:r>
       <w:r>
         <w:rPr>
           <w:rFonts w:ascii="Arial" w:hAnsi="Arial" w:eastAsia="Arial"/>
-          <w:color w:val="111111"/>
-          <w:sz w:val="16"/>
+          <w:b w:val="0"/>
+          <w:color w:val="262F38"/>
+          <w:sz w:val="17"/>
         </w:rPr>
       </w:r>
     </w:p>
     <w:p>
       <w:pPr>
-        <w:spacing w:before="0" w:after="24" w:line="245" w:lineRule="auto"/>
-        <w:ind w:left="202" w:hanging="144"/>
-        <w:keepLines/>
+        <w:keepNext w:val="0"/>
+        <w:pageBreakBefore w:val="0"/>
+        <w:spacing w:before="0" w:after="44" w:line="240" w:lineRule="auto"/>
+        <w:ind w:left="230" w:hanging="158"/>
       </w:pPr>
       <w:r>
         <w:rPr>
           <w:rFonts w:ascii="Arial" w:hAnsi="Arial" w:eastAsia="Arial"/>
-          <w:b/>
-          <w:color w:val="C49A45"/>
-          <w:sz w:val="16"/>
+          <w:b w:val="0"/>
+          <w:color w:val="262F38"/>
+          <w:sz w:val="17"/>
         </w:rPr>
         <w:t>• Modernized core workflows within a national procurement ecosystem operating at ~1M transactions/month across ~60K users, ~90K facilities/entities and ~300 suppliers, replacing fragmented manual processes with governed digital services.</w:t>
       </w:r>
       <w:r>
         <w:rPr>
           <w:rFonts w:ascii="Arial" w:hAnsi="Arial" w:eastAsia="Arial"/>
-          <w:color w:val="111111"/>
-          <w:sz w:val="16"/>
+          <w:b w:val="0"/>
+          <w:color w:val="262F38"/>
+          <w:sz w:val="17"/>
         </w:rPr>
       </w:r>
     </w:p>
     <w:p>
       <w:pPr>
-        <w:spacing w:before="0" w:after="24" w:line="245" w:lineRule="auto"/>
-        <w:ind w:left="202" w:hanging="144"/>
-        <w:keepLines/>
+        <w:keepNext w:val="0"/>
+        <w:pageBreakBefore w:val="0"/>
+        <w:spacing w:before="0" w:after="44" w:line="240" w:lineRule="auto"/>
+        <w:ind w:left="230" w:hanging="158"/>
       </w:pPr>
       <w:r>
         <w:rPr>
           <w:rFonts w:ascii="Arial" w:hAnsi="Arial" w:eastAsia="Arial"/>
-          <w:b/>
-          <w:color w:val="C49A45"/>
-          <w:sz w:val="16"/>
+          <w:b w:val="0"/>
+          <w:color w:val="262F38"/>
+          <w:sz w:val="17"/>
         </w:rPr>
         <w:t>• Shaped governance and technology direction for national initiatives including Pharmaceutical Track &amp; Trace, alongside multi-agency digital transformation and interoperability work.</w:t>
       </w:r>
       <w:r>
         <w:rPr>
           <w:rFonts w:ascii="Arial" w:hAnsi="Arial" w:eastAsia="Arial"/>
-          <w:color w:val="111111"/>
-          <w:sz w:val="16"/>
+          <w:b w:val="0"/>
+          <w:color w:val="262F38"/>
+          <w:sz w:val="17"/>
         </w:rPr>
       </w:r>
     </w:p>
     <w:p>
       <w:pPr>
-        <w:spacing w:before="0" w:after="24" w:line="245" w:lineRule="auto"/>
-        <w:ind w:left="202" w:hanging="144"/>
-        <w:keepLines/>
+        <w:keepNext w:val="0"/>
+        <w:pageBreakBefore w:val="0"/>
+        <w:spacing w:before="0" w:after="44" w:line="240" w:lineRule="auto"/>
+        <w:ind w:left="230" w:hanging="158"/>
       </w:pPr>
       <w:r>
         <w:rPr>
           <w:rFonts w:ascii="Arial" w:hAnsi="Arial" w:eastAsia="Arial"/>
-          <w:b/>
-          <w:color w:val="C49A45"/>
-          <w:sz w:val="16"/>
+          <w:b w:val="0"/>
+          <w:color w:val="262F38"/>
+          <w:sz w:val="17"/>
         </w:rPr>
         <w:t>• Led delivery across 15+ enterprise/e-government platforms in Oman, including the ~1M-user National Educational Portal and the Sultan Qaboos Award-winning Ministry of Education Recruitment System.</w:t>
       </w:r>
       <w:r>
         <w:rPr>
           <w:rFonts w:ascii="Arial" w:hAnsi="Arial" w:eastAsia="Arial"/>
-          <w:color w:val="111111"/>
-          <w:sz w:val="16"/>
+          <w:b w:val="0"/>
+          <w:color w:val="262F38"/>
+          <w:sz w:val="17"/>
         </w:rPr>
       </w:r>
     </w:p>
     <w:p>
       <w:pPr>
-        <w:spacing w:before="0" w:after="24" w:line="245" w:lineRule="auto"/>
-        <w:ind w:left="202" w:hanging="144"/>
-        <w:keepLines/>
+        <w:keepNext w:val="0"/>
+        <w:pageBreakBefore w:val="0"/>
+        <w:spacing w:before="0" w:after="44" w:line="240" w:lineRule="auto"/>
+        <w:ind w:left="230" w:hanging="158"/>
       </w:pPr>
       <w:r>
         <w:rPr>
-          <w:color w:val="C49A45"/>
-          <w:sz w:val="16"/>
+          <w:rFonts w:ascii="Arial" w:hAnsi="Arial"/>
+          <w:b w:val="0"/>
+          <w:color w:val="262F38"/>
+          <w:sz w:val="17"/>
         </w:rPr>
         <w:t>• Led hands-on delivery across 150+ major and mid-sized projects at Keyframe, including multiple award-winning digital solutions across government, healthcare, education and commercial sectors.</w:t>
       </w:r>
@@ -280,18 +299,18 @@
     <w:p>
       <w:pPr>
         <w:keepNext/>
-        <w:spacing w:before="120" w:after="40" w:line="245" w:lineRule="auto"/>
+        <w:spacing w:before="88" w:after="60" w:line="240" w:lineRule="auto"/>
+        <w:pageBreakBefore w:val="0"/>
         <w:pBdr>
-          <w:bottom w:val="single" w:sz="7" w:space="3" w:color="C49A45"/>
+          <w:bottom w:val="single" w:sz="5" w:space="3" w:color="B8C5D1"/>
         </w:pBdr>
-        <w:keepLines/>
       </w:pPr>
       <w:r>
         <w:rPr>
-          <w:rFonts w:ascii="Aptos Display" w:hAnsi="Aptos Display" w:eastAsia="Arial"/>
+          <w:rFonts w:ascii="Arial" w:hAnsi="Arial" w:eastAsia="Arial"/>
           <w:b/>
-          <w:color w:val="17324D"/>
-          <w:sz w:val="18"/>
+          <w:color w:val="183B56"/>
+          <w:sz w:val="19"/>
         </w:rPr>
         <w:t>PROFESSIONAL EXPERIENCE</w:t>
       </w:r>
@@ -299,43 +318,45 @@
     <w:p>
       <w:pPr>
         <w:keepNext/>
+        <w:pageBreakBefore w:val="0"/>
         <w:tabs>
-          <w:tab w:pos="10440" w:val="right"/>
+          <w:tab w:pos="10080" w:val="right"/>
         </w:tabs>
-        <w:spacing w:before="100" w:after="0" w:line="245" w:lineRule="auto"/>
-        <w:keepLines/>
+        <w:spacing w:before="72" w:after="16" w:line="240" w:lineRule="auto"/>
       </w:pPr>
       <w:r>
         <w:rPr>
-          <w:rFonts w:ascii="Arial" w:hAnsi="Arial" w:eastAsia="Arial"/>
+          <w:rFonts w:ascii="Arial" w:hAnsi="Arial"/>
           <w:b/>
-          <w:color w:val="17324D"/>
-          <w:sz w:val="17"/>
+          <w:color w:val="183B56"/>
+          <w:sz w:val="18"/>
         </w:rPr>
         <w:t>The Egyptian Authority for Unified Procurement, Medical Supply and Management of Medical Technology (UPA) | Cairo, Egypt</w:t>
       </w:r>
       <w:r>
+        <w:tab/>
+      </w:r>
+      <w:r>
         <w:rPr>
-          <w:rFonts w:ascii="Arial" w:hAnsi="Arial" w:eastAsia="Arial"/>
+          <w:rFonts w:ascii="Arial" w:hAnsi="Arial"/>
           <w:b/>
-          <w:color w:val="17324D"/>
+          <w:color w:val="46525E"/>
           <w:sz w:val="17"/>
         </w:rPr>
-        <w:tab/>
         <w:t>05/2025 - Present</w:t>
       </w:r>
     </w:p>
     <w:p>
       <w:pPr>
         <w:keepNext/>
-        <w:spacing w:before="0" w:after="20" w:line="245" w:lineRule="auto"/>
-        <w:keepLines/>
+        <w:pageBreakBefore w:val="0"/>
+        <w:spacing w:before="0" w:after="25" w:line="240" w:lineRule="auto"/>
       </w:pPr>
       <w:r>
         <w:rPr>
           <w:rFonts w:ascii="Arial" w:hAnsi="Arial" w:eastAsia="Arial"/>
           <w:b/>
-          <w:color w:val="C49A45"/>
+          <w:color w:val="183B56"/>
           <w:sz w:val="17"/>
         </w:rPr>
         <w:t>Head of the Central Administration for Information Systems &amp; Digital Transformation</w:t>
@@ -344,184 +365,197 @@
     <w:p>
       <w:pPr>
         <w:keepNext/>
-        <w:spacing w:before="0" w:after="40" w:line="245" w:lineRule="auto"/>
+        <w:pageBreakBefore w:val="0"/>
+        <w:spacing w:before="0" w:after="40" w:line="240" w:lineRule="auto"/>
       </w:pPr>
       <w:r>
         <w:rPr>
           <w:rFonts w:ascii="Arial" w:hAnsi="Arial" w:eastAsia="Arial"/>
           <w:b w:val="0"/>
           <w:i/>
-          <w:color w:val="5E6B72"/>
-          <w:sz w:val="15"/>
+          <w:color w:val="5D6974"/>
+          <w:sz w:val="16"/>
         </w:rPr>
         <w:t>Scope: Technology Strategy | Enterprise Systems &amp; Architecture | Portfolio, Risk, Service Governance &amp; Third-Party Coordination</w:t>
       </w:r>
     </w:p>
     <w:p>
       <w:pPr>
-        <w:spacing w:before="0" w:after="24" w:line="245" w:lineRule="auto"/>
-        <w:ind w:left="202" w:hanging="144"/>
-        <w:keepLines/>
+        <w:keepNext w:val="0"/>
+        <w:pageBreakBefore w:val="0"/>
+        <w:spacing w:before="0" w:after="44" w:line="240" w:lineRule="auto"/>
+        <w:ind w:left="230" w:hanging="158"/>
       </w:pPr>
       <w:r>
         <w:rPr>
           <w:rFonts w:ascii="Arial" w:hAnsi="Arial" w:eastAsia="Arial"/>
-          <w:b/>
-          <w:color w:val="C49A45"/>
-          <w:sz w:val="16"/>
+          <w:b w:val="0"/>
+          <w:color w:val="262F38"/>
+          <w:sz w:val="17"/>
         </w:rPr>
         <w:t>• Lead a 54-person technology organization across four major functions with seven direct reports spanning software, applications, analysis, QA/reporting, support/customer service, architecture, data and delivery governance.</w:t>
       </w:r>
       <w:r>
         <w:rPr>
           <w:rFonts w:ascii="Arial" w:hAnsi="Arial" w:eastAsia="Arial"/>
-          <w:color w:val="111111"/>
-          <w:sz w:val="16"/>
+          <w:b w:val="0"/>
+          <w:color w:val="262F38"/>
+          <w:sz w:val="17"/>
         </w:rPr>
       </w:r>
     </w:p>
     <w:p>
       <w:pPr>
-        <w:spacing w:before="0" w:after="24" w:line="245" w:lineRule="auto"/>
-        <w:ind w:left="202" w:hanging="144"/>
-        <w:keepLines/>
+        <w:keepNext w:val="0"/>
+        <w:pageBreakBefore w:val="0"/>
+        <w:spacing w:before="0" w:after="44" w:line="240" w:lineRule="auto"/>
+        <w:ind w:left="230" w:hanging="158"/>
       </w:pPr>
       <w:r>
         <w:rPr>
           <w:rFonts w:ascii="Arial" w:hAnsi="Arial" w:eastAsia="Arial"/>
-          <w:b/>
-          <w:color w:val="C49A45"/>
-          <w:sz w:val="16"/>
+          <w:b w:val="0"/>
+          <w:color w:val="262F38"/>
+          <w:sz w:val="17"/>
         </w:rPr>
         <w:t xml:space="preserve">• </w:t>
       </w:r>
       <w:r>
         <w:rPr>
           <w:rFonts w:ascii="Arial" w:hAnsi="Arial" w:eastAsia="Arial"/>
-          <w:color w:val="111111"/>
-          <w:sz w:val="16"/>
+          <w:b w:val="0"/>
+          <w:color w:val="262F38"/>
+          <w:sz w:val="17"/>
         </w:rPr>
         <w:t>Own the evolution of a unified national enterprise procurement platform covering demand consolidation, approvals, tendering, supplier evaluation, award/contracting, purchase orders, delivery/receipt, reporting, auditability, and support at national scale.</w:t>
       </w:r>
     </w:p>
     <w:p>
       <w:pPr>
-        <w:spacing w:before="0" w:after="24" w:line="245" w:lineRule="auto"/>
-        <w:ind w:left="202" w:hanging="144"/>
-        <w:keepLines/>
+        <w:keepNext w:val="0"/>
+        <w:pageBreakBefore w:val="0"/>
+        <w:spacing w:before="0" w:after="44" w:line="240" w:lineRule="auto"/>
+        <w:ind w:left="230" w:hanging="158"/>
       </w:pPr>
       <w:r>
         <w:rPr>
           <w:rFonts w:ascii="Arial" w:hAnsi="Arial" w:eastAsia="Arial"/>
-          <w:b/>
-          <w:color w:val="C49A45"/>
-          <w:sz w:val="16"/>
+          <w:b w:val="0"/>
+          <w:color w:val="262F38"/>
+          <w:sz w:val="17"/>
         </w:rPr>
         <w:t>• Govern enterprise/solution architecture for configurable, modular, API-first platforms covering RBAC, workflow/rules, DMS, auditability, data quality, integration, security, performance and resilience.</w:t>
       </w:r>
       <w:r>
         <w:rPr>
           <w:rFonts w:ascii="Arial" w:hAnsi="Arial" w:eastAsia="Arial"/>
-          <w:color w:val="111111"/>
-          <w:sz w:val="16"/>
+          <w:b w:val="0"/>
+          <w:color w:val="262F38"/>
+          <w:sz w:val="17"/>
         </w:rPr>
       </w:r>
     </w:p>
     <w:p>
       <w:pPr>
-        <w:spacing w:before="0" w:after="24" w:line="245" w:lineRule="auto"/>
-        <w:ind w:left="202" w:hanging="144"/>
-        <w:keepLines/>
+        <w:keepNext w:val="0"/>
+        <w:pageBreakBefore w:val="0"/>
+        <w:spacing w:before="0" w:after="44" w:line="240" w:lineRule="auto"/>
+        <w:ind w:left="230" w:hanging="158"/>
       </w:pPr>
       <w:r>
         <w:rPr>
           <w:rFonts w:ascii="Arial" w:hAnsi="Arial" w:eastAsia="Arial"/>
-          <w:b/>
-          <w:color w:val="C49A45"/>
-          <w:sz w:val="16"/>
+          <w:b w:val="0"/>
+          <w:color w:val="262F38"/>
+          <w:sz w:val="17"/>
         </w:rPr>
         <w:t>• Direct SDLC and portfolio delivery, architecture/release governance, production readiness, incident/RCA, technology vendor and third-party coordination, change management and modernization.</w:t>
       </w:r>
     </w:p>
     <w:p>
       <w:pPr>
-        <w:spacing w:before="0" w:after="24" w:line="245" w:lineRule="auto"/>
-        <w:ind w:left="202" w:hanging="144"/>
-        <w:keepLines/>
+        <w:keepNext w:val="0"/>
+        <w:pageBreakBefore w:val="0"/>
+        <w:spacing w:before="0" w:after="44" w:line="240" w:lineRule="auto"/>
+        <w:ind w:left="230" w:hanging="158"/>
       </w:pPr>
       <w:r>
         <w:rPr>
           <w:rFonts w:ascii="Arial" w:hAnsi="Arial" w:eastAsia="Arial"/>
-          <w:b/>
-          <w:color w:val="C49A45"/>
-          <w:sz w:val="16"/>
+          <w:b w:val="0"/>
+          <w:color w:val="262F38"/>
+          <w:sz w:val="17"/>
         </w:rPr>
         <w:t>• Lead service operations for ~60K users through a ~20-person support/customer-service function covering service desk/call center, CRM case handling, SLAs, escalation, onboarding, training and adoption.</w:t>
       </w:r>
       <w:r>
         <w:rPr>
           <w:rFonts w:ascii="Arial" w:hAnsi="Arial" w:eastAsia="Arial"/>
-          <w:color w:val="111111"/>
-          <w:sz w:val="16"/>
+          <w:b w:val="0"/>
+          <w:color w:val="262F38"/>
+          <w:sz w:val="17"/>
         </w:rPr>
       </w:r>
     </w:p>
     <w:p>
       <w:pPr>
-        <w:spacing w:before="0" w:after="24" w:line="245" w:lineRule="auto"/>
-        <w:ind w:left="202" w:hanging="144"/>
-        <w:keepLines/>
+        <w:keepNext w:val="0"/>
+        <w:pageBreakBefore w:val="0"/>
+        <w:spacing w:before="0" w:after="44" w:line="240" w:lineRule="auto"/>
+        <w:ind w:left="230" w:hanging="158"/>
       </w:pPr>
       <w:r>
         <w:rPr>
           <w:rFonts w:ascii="Arial" w:hAnsi="Arial" w:eastAsia="Arial"/>
-          <w:b/>
-          <w:color w:val="C49A45"/>
-          <w:sz w:val="16"/>
+          <w:b w:val="0"/>
+          <w:color w:val="262F38"/>
+          <w:sz w:val="17"/>
         </w:rPr>
         <w:t>• Drive IT and technology strategy, technology operating model and engineering standards; strengthen data governance, information-security governance, IT risk controls, executive KPIs and controlled enterprise AI adoption.</w:t>
       </w:r>
     </w:p>
     <w:p>
       <w:pPr>
-        <w:keepNext/>
+        <w:keepNext w:val="0"/>
+        <w:pageBreakBefore w:val="0"/>
         <w:tabs>
-          <w:tab w:pos="10440" w:val="right"/>
+          <w:tab w:pos="10080" w:val="right"/>
         </w:tabs>
-        <w:spacing w:before="100" w:after="0" w:line="245" w:lineRule="auto"/>
-        <w:keepLines/>
+        <w:spacing w:before="50" w:after="41" w:line="240" w:lineRule="auto"/>
       </w:pPr>
       <w:r>
         <w:rPr>
-          <w:rFonts w:ascii="Arial" w:hAnsi="Arial" w:eastAsia="Arial"/>
+          <w:rFonts w:ascii="Arial" w:hAnsi="Arial"/>
           <w:b/>
-          <w:color w:val="17324D"/>
-          <w:sz w:val="17"/>
+          <w:color w:val="183B56"/>
+          <w:sz w:val="18"/>
         </w:rPr>
         <w:t>The Egyptian Authority for Unified Procurement, Medical Supply and Management of Medical Technology (UPA) | Cairo, Egypt</w:t>
       </w:r>
       <w:r>
+        <w:tab/>
+      </w:r>
+      <w:r>
         <w:rPr>
-          <w:rFonts w:ascii="Arial" w:hAnsi="Arial" w:eastAsia="Arial"/>
+          <w:rFonts w:ascii="Arial" w:hAnsi="Arial"/>
           <w:b/>
-          <w:color w:val="17324D"/>
+          <w:color w:val="46525E"/>
           <w:sz w:val="17"/>
         </w:rPr>
-        <w:tab/>
         <w:t>10/2020 - 05/2025</w:t>
       </w:r>
     </w:p>
     <w:p>
       <w:pPr>
         <w:keepNext/>
-        <w:spacing w:before="0" w:after="20" w:line="245" w:lineRule="auto"/>
-        <w:keepLines/>
+        <w:pageBreakBefore w:val="0"/>
+        <w:spacing w:before="0" w:after="25" w:line="240" w:lineRule="auto"/>
       </w:pPr>
       <w:r>
         <w:rPr>
           <w:rFonts w:ascii="Arial" w:hAnsi="Arial" w:eastAsia="Arial"/>
           <w:b/>
-          <w:color w:val="C49A45"/>
+          <w:color w:val="183B56"/>
           <w:sz w:val="17"/>
         </w:rPr>
         <w:t>General Manager - Systems, Applications &amp; Technical Support</w:t>
@@ -529,151 +563,156 @@
     </w:p>
     <w:p>
       <w:pPr>
-        <w:spacing w:before="0" w:after="24" w:line="245" w:lineRule="auto"/>
-        <w:ind w:left="202" w:hanging="144"/>
-        <w:keepLines/>
+        <w:keepNext w:val="0"/>
+        <w:pageBreakBefore w:val="0"/>
+        <w:spacing w:before="0" w:after="44" w:line="240" w:lineRule="auto"/>
+        <w:ind w:left="230" w:hanging="158"/>
       </w:pPr>
       <w:r>
         <w:rPr>
           <w:rFonts w:ascii="Arial" w:hAnsi="Arial" w:eastAsia="Arial"/>
-          <w:b/>
-          <w:color w:val="C49A45"/>
-          <w:sz w:val="16"/>
+          <w:b w:val="0"/>
+          <w:color w:val="262F38"/>
+          <w:sz w:val="17"/>
         </w:rPr>
         <w:t xml:space="preserve">• </w:t>
       </w:r>
       <w:r>
         <w:rPr>
           <w:rFonts w:ascii="Arial" w:hAnsi="Arial" w:eastAsia="Arial"/>
-          <w:color w:val="111111"/>
-          <w:sz w:val="16"/>
+          <w:b w:val="0"/>
+          <w:color w:val="262F38"/>
+          <w:sz w:val="17"/>
         </w:rPr>
         <w:t>Directed applications, systems, technical support, and customer-service delivery across procurement, medical-supply, inventory, reporting, CMS/publishing, enterprise workflows, and stakeholder-service capabilities.</w:t>
       </w:r>
     </w:p>
     <w:p>
       <w:pPr>
-        <w:spacing w:before="0" w:after="24" w:line="245" w:lineRule="auto"/>
-        <w:ind w:left="202" w:hanging="144"/>
-        <w:keepLines/>
+        <w:keepNext w:val="0"/>
+        <w:pageBreakBefore w:val="0"/>
+        <w:spacing w:before="0" w:after="44" w:line="240" w:lineRule="auto"/>
+        <w:ind w:left="230" w:hanging="158"/>
       </w:pPr>
       <w:r>
         <w:rPr>
           <w:rFonts w:ascii="Arial" w:hAnsi="Arial" w:eastAsia="Arial"/>
-          <w:b/>
-          <w:color w:val="C49A45"/>
-          <w:sz w:val="16"/>
+          <w:b w:val="0"/>
+          <w:color w:val="262F38"/>
+          <w:sz w:val="17"/>
         </w:rPr>
         <w:t xml:space="preserve">• </w:t>
       </w:r>
       <w:r>
         <w:rPr>
           <w:rFonts w:ascii="Arial" w:hAnsi="Arial" w:eastAsia="Arial"/>
-          <w:color w:val="111111"/>
-          <w:sz w:val="16"/>
+          <w:b w:val="0"/>
+          <w:color w:val="262F38"/>
+          <w:sz w:val="17"/>
         </w:rPr>
         <w:t>Built and modernized configurable digital workflows that replaced large volumes of manual, paper-, Excel-, and email-based processes, improving turnaround, traceability, governance, and operational efficiency.</w:t>
       </w:r>
     </w:p>
     <w:p>
       <w:pPr>
-        <w:spacing w:before="0" w:after="24" w:line="245" w:lineRule="auto"/>
-        <w:ind w:left="202" w:hanging="144"/>
-        <w:keepLines/>
+        <w:keepNext w:val="0"/>
+        <w:pageBreakBefore w:val="0"/>
+        <w:spacing w:before="0" w:after="44" w:line="240" w:lineRule="auto"/>
+        <w:ind w:left="230" w:hanging="158"/>
       </w:pPr>
       <w:r>
         <w:rPr>
           <w:rFonts w:ascii="Arial" w:hAnsi="Arial" w:eastAsia="Arial"/>
-          <w:b/>
-          <w:color w:val="C49A45"/>
-          <w:sz w:val="16"/>
+          <w:b w:val="0"/>
+          <w:color w:val="262F38"/>
+          <w:sz w:val="17"/>
         </w:rPr>
         <w:t xml:space="preserve">• </w:t>
       </w:r>
       <w:r>
         <w:rPr>
           <w:rFonts w:ascii="Arial" w:hAnsi="Arial" w:eastAsia="Arial"/>
-          <w:color w:val="111111"/>
-          <w:sz w:val="16"/>
+          <w:b w:val="0"/>
+          <w:color w:val="262F38"/>
+          <w:sz w:val="17"/>
         </w:rPr>
         <w:t>Strengthened engineering and service delivery through clearer ownership, technical standards, design/code reviews, QA/release gates, documentation, incident/RCA practices, knowledge transfer, and repeatable support procedures.</w:t>
       </w:r>
     </w:p>
     <w:p>
       <w:pPr>
-        <w:spacing w:before="0" w:after="24" w:line="245" w:lineRule="auto"/>
-        <w:ind w:left="202" w:hanging="144"/>
-        <w:keepLines/>
+        <w:keepNext w:val="0"/>
+        <w:pageBreakBefore w:val="0"/>
+        <w:spacing w:before="0" w:after="44" w:line="240" w:lineRule="auto"/>
+        <w:ind w:left="230" w:hanging="158"/>
       </w:pPr>
       <w:r>
         <w:rPr>
           <w:rFonts w:ascii="Arial" w:hAnsi="Arial" w:eastAsia="Arial"/>
-          <w:b/>
-          <w:color w:val="C49A45"/>
-          <w:sz w:val="16"/>
+          <w:b w:val="0"/>
+          <w:color w:val="262F38"/>
+          <w:sz w:val="17"/>
         </w:rPr>
         <w:t xml:space="preserve">• </w:t>
       </w:r>
       <w:r>
         <w:rPr>
           <w:rFonts w:ascii="Arial" w:hAnsi="Arial" w:eastAsia="Arial"/>
-          <w:color w:val="111111"/>
-          <w:sz w:val="16"/>
+          <w:b w:val="0"/>
+          <w:color w:val="262F38"/>
+          <w:sz w:val="17"/>
         </w:rPr>
         <w:t>Coordinated complex multi-agency initiatives and nationwide onboarding, training, support, issue escalation, feedback, and adoption across public-sector stakeholders.</w:t>
       </w:r>
     </w:p>
     <w:p>
       <w:pPr>
-        <w:spacing w:line="245" w:lineRule="auto" w:after="40"/>
+        <w:pageBreakBefore w:val="0"/>
+      </w:pPr>
+      <w:r/>
+    </w:p>
+    <w:p>
+      <w:pPr>
+        <w:keepNext w:val="0"/>
+        <w:pageBreakBefore w:val="0"/>
+        <w:tabs>
+          <w:tab w:pos="10080" w:val="right"/>
+        </w:tabs>
+        <w:spacing w:before="50" w:after="41" w:line="240" w:lineRule="auto"/>
       </w:pPr>
       <w:r>
         <w:rPr>
-          <w:sz w:val="16"/>
-        </w:rPr>
-        <w:br w:type="page"/>
-      </w:r>
-    </w:p>
-    <w:p>
-      <w:pPr>
-        <w:keepNext/>
-        <w:tabs>
-          <w:tab w:pos="10440" w:val="right"/>
-        </w:tabs>
-        <w:spacing w:before="100" w:after="0" w:line="245" w:lineRule="auto"/>
-        <w:keepLines/>
-      </w:pPr>
-      <w:r>
-        <w:rPr>
-          <w:rFonts w:ascii="Arial" w:hAnsi="Arial" w:eastAsia="Arial"/>
+          <w:rFonts w:ascii="Arial" w:hAnsi="Arial"/>
           <w:b/>
-          <w:color w:val="17324D"/>
-          <w:sz w:val="17"/>
+          <w:color w:val="183B56"/>
+          <w:sz w:val="18"/>
         </w:rPr>
         <w:t>Integral Solutions LLC | Muscat, Oman</w:t>
       </w:r>
       <w:r>
+        <w:tab/>
+      </w:r>
+      <w:r>
         <w:rPr>
-          <w:rFonts w:ascii="Arial" w:hAnsi="Arial" w:eastAsia="Arial"/>
+          <w:rFonts w:ascii="Arial" w:hAnsi="Arial"/>
           <w:b/>
-          <w:color w:val="17324D"/>
+          <w:color w:val="46525E"/>
           <w:sz w:val="17"/>
         </w:rPr>
-        <w:tab/>
         <w:t>05/2016 - 10/2020</w:t>
       </w:r>
     </w:p>
     <w:p>
       <w:pPr>
         <w:keepNext/>
-        <w:spacing w:before="0" w:after="20" w:line="245" w:lineRule="auto"/>
-        <w:keepLines/>
+        <w:pageBreakBefore w:val="0"/>
+        <w:spacing w:before="0" w:after="25" w:line="240" w:lineRule="auto"/>
       </w:pPr>
       <w:r>
         <w:rPr>
           <w:rFonts w:ascii="Arial" w:hAnsi="Arial" w:eastAsia="Arial"/>
           <w:b/>
-          <w:color w:val="C49A45"/>
+          <w:color w:val="183B56"/>
           <w:sz w:val="17"/>
         </w:rPr>
         <w:t>Development Team Leader &amp; Senior Full-Stack Developer | Government Client Assignments</w:t>
@@ -681,136 +720,146 @@
     </w:p>
     <w:p>
       <w:pPr>
-        <w:spacing w:before="0" w:after="24" w:line="245" w:lineRule="auto"/>
-        <w:ind w:left="202" w:hanging="144"/>
-        <w:keepLines/>
+        <w:keepNext w:val="0"/>
+        <w:pageBreakBefore w:val="0"/>
+        <w:spacing w:before="0" w:after="44" w:line="240" w:lineRule="auto"/>
+        <w:ind w:left="230" w:hanging="158"/>
       </w:pPr>
       <w:r>
         <w:rPr>
           <w:rFonts w:ascii="Arial" w:hAnsi="Arial" w:eastAsia="Arial"/>
-          <w:b/>
-          <w:color w:val="C49A45"/>
-          <w:sz w:val="16"/>
+          <w:b w:val="0"/>
+          <w:color w:val="262F38"/>
+          <w:sz w:val="17"/>
         </w:rPr>
         <w:t>• Led a 10+ developer team while remaining hands-on across 15+ enterprise/e-government platforms; worked extensively on Oman Ministry of Education’s national Educational Portal (~1M users) across development, database/reporting, testing, deployment, rollout and production support.</w:t>
       </w:r>
       <w:r>
         <w:rPr>
           <w:rFonts w:ascii="Arial" w:hAnsi="Arial" w:eastAsia="Arial"/>
-          <w:color w:val="111111"/>
-          <w:sz w:val="16"/>
+          <w:b w:val="0"/>
+          <w:color w:val="262F38"/>
+          <w:sz w:val="17"/>
         </w:rPr>
       </w:r>
     </w:p>
     <w:p>
       <w:pPr>
-        <w:spacing w:before="0" w:after="24" w:line="245" w:lineRule="auto"/>
-        <w:ind w:left="202" w:hanging="144"/>
-        <w:keepLines/>
+        <w:keepNext w:val="0"/>
+        <w:pageBreakBefore w:val="0"/>
+        <w:spacing w:before="0" w:after="44" w:line="240" w:lineRule="auto"/>
+        <w:ind w:left="230" w:hanging="158"/>
       </w:pPr>
       <w:r>
         <w:rPr>
           <w:rFonts w:ascii="Arial" w:hAnsi="Arial" w:eastAsia="Arial"/>
-          <w:b/>
-          <w:color w:val="C49A45"/>
-          <w:sz w:val="16"/>
+          <w:b w:val="0"/>
+          <w:color w:val="262F38"/>
+          <w:sz w:val="17"/>
         </w:rPr>
         <w:t>• Contributed extensively to the large-scale Maktabi / Morasalat electronic correspondence platform for Omani government entities, working hands-on on correspondence creation, routing, forwarding and tracking, reports, database components, functional testing, defect investigation, production deployment and release/application support.</w:t>
       </w:r>
       <w:r>
         <w:rPr>
           <w:rFonts w:ascii="Arial" w:hAnsi="Arial" w:eastAsia="Arial"/>
-          <w:color w:val="111111"/>
-          <w:sz w:val="16"/>
+          <w:b w:val="0"/>
+          <w:color w:val="262F38"/>
+          <w:sz w:val="17"/>
         </w:rPr>
       </w:r>
     </w:p>
     <w:p>
       <w:pPr>
-        <w:spacing w:before="0" w:after="24" w:line="245" w:lineRule="auto"/>
-        <w:ind w:left="202" w:hanging="144"/>
-        <w:keepLines/>
+        <w:keepNext w:val="0"/>
+        <w:pageBreakBefore w:val="0"/>
+        <w:spacing w:before="0" w:after="44" w:line="240" w:lineRule="auto"/>
+        <w:ind w:left="230" w:hanging="158"/>
       </w:pPr>
       <w:r>
         <w:rPr>
           <w:rFonts w:ascii="Arial" w:hAnsi="Arial" w:eastAsia="Arial"/>
-          <w:b/>
-          <w:color w:val="C49A45"/>
-          <w:sz w:val="16"/>
+          <w:b w:val="0"/>
+          <w:color w:val="262F38"/>
+          <w:sz w:val="17"/>
         </w:rPr>
         <w:t>• Delivered the Ministry of Education Recruitment System — recipient of the Sultan Qaboos Award — plus International Schools, Crisis Management and Asset Management systems; also contributed to Ministry of Agriculture delivery and Al Wahat Club Management System for Royal Court Affairs.</w:t>
       </w:r>
       <w:r>
         <w:rPr>
           <w:rFonts w:ascii="Arial" w:hAnsi="Arial" w:eastAsia="Arial"/>
-          <w:color w:val="111111"/>
-          <w:sz w:val="16"/>
+          <w:b w:val="0"/>
+          <w:color w:val="262F38"/>
+          <w:sz w:val="17"/>
         </w:rPr>
       </w:r>
     </w:p>
     <w:p>
       <w:pPr>
-        <w:spacing w:before="0" w:after="24" w:line="245" w:lineRule="auto"/>
-        <w:ind w:left="202" w:hanging="144"/>
-        <w:keepLines/>
+        <w:keepNext w:val="0"/>
+        <w:pageBreakBefore w:val="0"/>
+        <w:spacing w:before="0" w:after="44" w:line="240" w:lineRule="auto"/>
+        <w:ind w:left="230" w:hanging="158"/>
       </w:pPr>
       <w:r>
         <w:rPr>
           <w:rFonts w:ascii="Arial" w:hAnsi="Arial" w:eastAsia="Arial"/>
-          <w:b/>
-          <w:color w:val="C49A45"/>
-          <w:sz w:val="16"/>
+          <w:b w:val="0"/>
+          <w:color w:val="262F38"/>
+          <w:sz w:val="17"/>
         </w:rPr>
         <w:t>• Worked across full-cycle government-system delivery using C#/.NET, ASP.NET, SQL Server/MySQL, JavaScript, REST/SOAP services, workflow/RBAC, reporting, integrations, testing, deployment and production-support practices.</w:t>
       </w:r>
       <w:r>
         <w:rPr>
           <w:rFonts w:ascii="Arial" w:hAnsi="Arial" w:eastAsia="Arial"/>
-          <w:color w:val="111111"/>
-          <w:sz w:val="16"/>
+          <w:b w:val="0"/>
+          <w:color w:val="262F38"/>
+          <w:sz w:val="17"/>
         </w:rPr>
       </w:r>
     </w:p>
     <w:p>
       <w:pPr>
-        <w:keepNext/>
+        <w:keepNext w:val="0"/>
+        <w:pageBreakBefore w:val="0"/>
         <w:tabs>
-          <w:tab w:pos="10440" w:val="right"/>
+          <w:tab w:pos="10080" w:val="right"/>
         </w:tabs>
-        <w:spacing w:before="100" w:after="0" w:line="245" w:lineRule="auto"/>
-        <w:keepLines/>
+        <w:spacing w:before="50" w:after="41" w:line="240" w:lineRule="auto"/>
       </w:pPr>
       <w:r>
         <w:rPr>
-          <w:rFonts w:ascii="Arial" w:hAnsi="Arial" w:eastAsia="Arial"/>
+          <w:rFonts w:ascii="Arial" w:hAnsi="Arial"/>
           <w:b/>
-          <w:color w:val="17324D"/>
-          <w:sz w:val="17"/>
+          <w:color w:val="183B56"/>
+          <w:sz w:val="18"/>
         </w:rPr>
         <w:t>Keyframe Egypt | Cairo, Egypt</w:t>
       </w:r>
       <w:r>
+        <w:tab/>
+      </w:r>
+      <w:r>
         <w:rPr>
-          <w:rFonts w:ascii="Arial" w:hAnsi="Arial" w:eastAsia="Arial"/>
+          <w:rFonts w:ascii="Arial" w:hAnsi="Arial"/>
           <w:b/>
-          <w:color w:val="17324D"/>
+          <w:color w:val="46525E"/>
           <w:sz w:val="17"/>
         </w:rPr>
-        <w:tab/>
         <w:t>04/2011 - 05/2016</w:t>
       </w:r>
     </w:p>
     <w:p>
       <w:pPr>
         <w:keepNext/>
-        <w:spacing w:before="0" w:after="20" w:line="245" w:lineRule="auto"/>
-        <w:keepLines/>
+        <w:pageBreakBefore w:val="0"/>
+        <w:spacing w:before="0" w:after="25" w:line="240" w:lineRule="auto"/>
       </w:pPr>
       <w:r>
         <w:rPr>
           <w:rFonts w:ascii="Arial" w:hAnsi="Arial" w:eastAsia="Arial"/>
           <w:b/>
-          <w:color w:val="C49A45"/>
+          <w:color w:val="183B56"/>
           <w:sz w:val="17"/>
         </w:rPr>
         <w:t>Development Team Leader &amp; Senior Full-Stack Developer</w:t>
@@ -818,53 +867,59 @@
     </w:p>
     <w:p>
       <w:pPr>
-        <w:spacing w:before="0" w:after="24" w:line="245" w:lineRule="auto"/>
-        <w:ind w:left="202" w:hanging="144"/>
-        <w:keepLines/>
+        <w:keepNext w:val="0"/>
+        <w:pageBreakBefore w:val="0"/>
+        <w:spacing w:before="0" w:after="44" w:line="240" w:lineRule="auto"/>
+        <w:ind w:left="230" w:hanging="158"/>
       </w:pPr>
       <w:r>
         <w:rPr>
           <w:rFonts w:ascii="Arial" w:hAnsi="Arial" w:eastAsia="Arial"/>
-          <w:b/>
-          <w:color w:val="C49A45"/>
-          <w:sz w:val="16"/>
+          <w:b w:val="0"/>
+          <w:color w:val="262F38"/>
+          <w:sz w:val="17"/>
         </w:rPr>
         <w:t>• Led a 6-person development team while remaining deeply hands-on across 150+ major and mid-sized projects in government, healthcare, education, construction, automotive, events and commercial sectors; small projects are not included in this count.</w:t>
       </w:r>
       <w:r>
         <w:rPr>
           <w:rFonts w:ascii="Arial" w:hAnsi="Arial" w:eastAsia="Arial"/>
-          <w:color w:val="111111"/>
-          <w:sz w:val="16"/>
+          <w:b w:val="0"/>
+          <w:color w:val="262F38"/>
+          <w:sz w:val="17"/>
         </w:rPr>
       </w:r>
     </w:p>
     <w:p>
       <w:pPr>
-        <w:spacing w:before="0" w:after="24" w:line="245" w:lineRule="auto"/>
-        <w:ind w:left="202" w:hanging="144"/>
-        <w:keepLines/>
+        <w:keepNext w:val="0"/>
+        <w:pageBreakBefore w:val="0"/>
+        <w:spacing w:before="0" w:after="44" w:line="240" w:lineRule="auto"/>
+        <w:ind w:left="230" w:hanging="158"/>
       </w:pPr>
       <w:r>
         <w:rPr>
           <w:rFonts w:ascii="Arial" w:hAnsi="Arial" w:eastAsia="Arial"/>
-          <w:b/>
-          <w:color w:val="C49A45"/>
-          <w:sz w:val="16"/>
+          <w:b w:val="0"/>
+          <w:color w:val="262F38"/>
+          <w:sz w:val="17"/>
         </w:rPr>
         <w:t>• Delivered public-sector and enterprise solutions spanning Ministry of Health work, conference platforms, education and HR systems, support desks and integrations, covering analysis, C#/.NET development, databases, reporting, testing, deployment and support.</w:t>
       </w:r>
     </w:p>
     <w:p>
       <w:pPr>
-        <w:spacing w:line="245" w:lineRule="auto" w:after="24"/>
-        <w:ind w:left="202" w:hanging="144"/>
-        <w:keepLines/>
+        <w:keepNext w:val="0"/>
+        <w:pageBreakBefore w:val="0"/>
+        <w:spacing w:after="44"/>
+        <w:ind w:left="230" w:hanging="158"/>
       </w:pPr>
       <w:r>
         <w:rPr>
-          <w:color w:val="C49A45"/>
-          <w:sz w:val="16"/>
+          <w:rFonts w:ascii="Arial" w:hAnsi="Arial"/>
+          <w:b w:val="0"/>
+          <w:color w:val="262F38"/>
+          <w:sz w:val="17"/>
         </w:rPr>
         <w:t>• Delivered multiple award-winning digital solutions, including Yashfeen, an ITIDA competition-winning healthcare portal.</w:t>
       </w:r>
@@ -872,68 +927,72 @@
     <CT_P/>
     <w:p>
       <w:pPr>
-        <w:spacing w:before="0" w:after="24" w:line="245" w:lineRule="auto"/>
-        <w:ind w:left="202" w:hanging="144"/>
-        <w:keepLines/>
+        <w:keepNext w:val="0"/>
+        <w:pageBreakBefore w:val="0"/>
+        <w:spacing w:before="0" w:after="44" w:line="240" w:lineRule="auto"/>
+        <w:ind w:left="230" w:hanging="158"/>
       </w:pPr>
       <w:r>
         <w:rPr>
           <w:rFonts w:ascii="Arial" w:hAnsi="Arial" w:eastAsia="Arial"/>
-          <w:b/>
-          <w:color w:val="C49A45"/>
-          <w:sz w:val="16"/>
+          <w:b w:val="0"/>
+          <w:color w:val="262F38"/>
+          <w:sz w:val="17"/>
         </w:rPr>
         <w:t xml:space="preserve">• </w:t>
       </w:r>
       <w:r>
         <w:rPr>
           <w:rFonts w:ascii="Arial" w:hAnsi="Arial" w:eastAsia="Arial"/>
-          <w:color w:val="111111"/>
-          <w:sz w:val="16"/>
+          <w:b w:val="0"/>
+          <w:color w:val="262F38"/>
+          <w:sz w:val="17"/>
         </w:rPr>
-        <w:t>Built and customized CMS/electronic-publishing solutions, including a custom .NET CMS and reusable electronic-publishing solutions, with multilingual/RTL publishing, workflows, versioning, archiving, permissions, search, SEO, analytics, and integrations.</w:t>
+        <w:t>Built and customized CMS/electronic-publishing solutions, including a custom .NET CMS plus hands-on Umbraco and Kentico work, with multilingual/RTL publishing, workflows, versioning, archiving, permissions, search, SEO, analytics, and integrations.</w:t>
       </w:r>
     </w:p>
     <w:p>
       <w:pPr>
-        <w:keepNext/>
+        <w:keepNext w:val="0"/>
+        <w:pageBreakBefore w:val="0"/>
         <w:tabs>
-          <w:tab w:pos="10440" w:val="right"/>
+          <w:tab w:pos="10080" w:val="right"/>
         </w:tabs>
-        <w:spacing w:before="100" w:after="0" w:line="245" w:lineRule="auto"/>
-        <w:keepLines/>
+        <w:spacing w:before="50" w:after="41" w:line="240" w:lineRule="auto"/>
       </w:pPr>
       <w:r>
         <w:rPr>
-          <w:rFonts w:ascii="Arial" w:hAnsi="Arial" w:eastAsia="Arial"/>
+          <w:rFonts w:ascii="Arial" w:hAnsi="Arial"/>
           <w:b/>
-          <w:color w:val="17324D"/>
-          <w:sz w:val="17"/>
+          <w:color w:val="183B56"/>
+          <w:sz w:val="18"/>
         </w:rPr>
         <w:t>Egyptian Armed Forces | Egypt</w:t>
       </w:r>
       <w:r>
+        <w:tab/>
+      </w:r>
+      <w:r>
         <w:rPr>
-          <w:rFonts w:ascii="Arial" w:hAnsi="Arial" w:eastAsia="Arial"/>
+          <w:rFonts w:ascii="Arial" w:hAnsi="Arial"/>
           <w:b/>
-          <w:color w:val="17324D"/>
+          <w:color w:val="46525E"/>
           <w:sz w:val="17"/>
         </w:rPr>
-        <w:tab/>
         <w:t>04/2008 - 10/2010</w:t>
       </w:r>
     </w:p>
     <w:p>
       <w:pPr>
         <w:keepNext/>
-        <w:spacing w:before="0" w:after="20" w:line="245" w:lineRule="auto"/>
-        <w:keepLines/>
+        <w:pageBreakBefore w:val="0"/>
+        <w:spacing w:before="0" w:after="25" w:line="240" w:lineRule="auto"/>
       </w:pPr>
       <w:r>
         <w:rPr>
           <w:rFonts w:ascii="Arial" w:hAnsi="Arial" w:eastAsia="Arial"/>
           <w:b/>
-          <w:color w:val="C49A45"/>
+          <w:color w:val="183B56"/>
           <w:sz w:val="17"/>
         </w:rPr>
         <w:t>Linux Systems &amp; Web Developer</w:t>
@@ -941,24 +1000,26 @@
     </w:p>
     <w:p>
       <w:pPr>
-        <w:spacing w:before="0" w:after="24" w:line="245" w:lineRule="auto"/>
-        <w:ind w:left="202" w:hanging="144"/>
-        <w:keepLines/>
+        <w:keepNext w:val="0"/>
+        <w:pageBreakBefore w:val="0"/>
+        <w:spacing w:before="0" w:after="44" w:line="240" w:lineRule="auto"/>
+        <w:ind w:left="230" w:hanging="158"/>
       </w:pPr>
       <w:r>
         <w:rPr>
           <w:rFonts w:ascii="Arial" w:hAnsi="Arial" w:eastAsia="Arial"/>
-          <w:b/>
-          <w:color w:val="C49A45"/>
-          <w:sz w:val="16"/>
+          <w:b w:val="0"/>
+          <w:color w:val="262F38"/>
+          <w:sz w:val="17"/>
         </w:rPr>
         <w:t xml:space="preserve">• </w:t>
       </w:r>
       <w:r>
         <w:rPr>
           <w:rFonts w:ascii="Arial" w:hAnsi="Arial" w:eastAsia="Arial"/>
-          <w:color w:val="111111"/>
-          <w:sz w:val="16"/>
+          <w:b w:val="0"/>
+          <w:color w:val="262F38"/>
+          <w:sz w:val="17"/>
         </w:rPr>
         <w:t>Contributed to Egypt's first Linux distribution, working on Linux from Scratch builds, kernel modules, optimization, and platform hardening; also built secure internal ASP.NET/SQL Server applications.</w:t>
       </w:r>
@@ -966,89 +1027,95 @@
     <w:p>
       <w:pPr>
         <w:keepNext/>
-        <w:spacing w:before="120" w:after="40" w:line="245" w:lineRule="auto"/>
+        <w:spacing w:before="88" w:after="60" w:line="240" w:lineRule="auto"/>
+        <w:pageBreakBefore w:val="0"/>
         <w:pBdr>
-          <w:bottom w:val="single" w:sz="7" w:space="3" w:color="C49A45"/>
+          <w:bottom w:val="single" w:sz="5" w:space="3" w:color="B8C5D1"/>
         </w:pBdr>
-        <w:keepLines/>
       </w:pPr>
       <w:r>
         <w:rPr>
-          <w:rFonts w:ascii="Aptos Display" w:hAnsi="Aptos Display" w:eastAsia="Arial"/>
+          <w:rFonts w:ascii="Arial" w:hAnsi="Arial" w:eastAsia="Arial"/>
           <w:b/>
-          <w:color w:val="17324D"/>
-          <w:sz w:val="18"/>
+          <w:color w:val="183B56"/>
+          <w:sz w:val="19"/>
         </w:rPr>
         <w:t>LEADERSHIP APPOINTMENTS &amp; GOVERNANCE CONTRIBUTIONS</w:t>
       </w:r>
     </w:p>
     <w:p>
       <w:pPr>
-        <w:spacing w:before="0" w:after="24" w:line="245" w:lineRule="auto"/>
-        <w:ind w:left="202" w:hanging="144"/>
-        <w:keepLines/>
+        <w:keepNext w:val="0"/>
+        <w:pageBreakBefore w:val="0"/>
+        <w:spacing w:before="0" w:after="44" w:line="240" w:lineRule="auto"/>
+        <w:ind w:left="230" w:hanging="158"/>
       </w:pPr>
       <w:r>
         <w:rPr>
           <w:rFonts w:ascii="Arial" w:hAnsi="Arial" w:eastAsia="Arial"/>
-          <w:b/>
-          <w:color w:val="C49A45"/>
-          <w:sz w:val="16"/>
+          <w:b w:val="0"/>
+          <w:color w:val="262F38"/>
+          <w:sz w:val="17"/>
         </w:rPr>
         <w:t>• Member, Egypt Digital Transformation Committee supporting the World Bank Group B-READY Assessment (2025-2026): contributed technical input on private-sector digitization, public-service modernization and national competitiveness.</w:t>
       </w:r>
       <w:r>
         <w:rPr>
           <w:rFonts w:ascii="Arial" w:hAnsi="Arial" w:eastAsia="Arial"/>
-          <w:color w:val="111111"/>
-          <w:sz w:val="16"/>
+          <w:b w:val="0"/>
+          <w:color w:val="262F38"/>
+          <w:sz w:val="17"/>
         </w:rPr>
       </w:r>
     </w:p>
     <w:p>
       <w:pPr>
-        <w:spacing w:before="0" w:after="24" w:line="245" w:lineRule="auto"/>
-        <w:ind w:left="202" w:hanging="144"/>
-        <w:keepLines/>
+        <w:keepNext w:val="0"/>
+        <w:pageBreakBefore w:val="0"/>
+        <w:spacing w:before="0" w:after="44" w:line="240" w:lineRule="auto"/>
+        <w:ind w:left="230" w:hanging="158"/>
       </w:pPr>
       <w:r>
         <w:rPr>
           <w:rFonts w:ascii="Arial" w:hAnsi="Arial" w:eastAsia="Arial"/>
-          <w:b/>
-          <w:color w:val="C49A45"/>
-          <w:sz w:val="16"/>
+          <w:b w:val="0"/>
+          <w:color w:val="262F38"/>
+          <w:sz w:val="17"/>
         </w:rPr>
         <w:t xml:space="preserve">• </w:t>
       </w:r>
       <w:r>
         <w:rPr>
           <w:rFonts w:ascii="Arial" w:hAnsi="Arial" w:eastAsia="Arial"/>
-          <w:color w:val="111111"/>
-          <w:sz w:val="16"/>
+          <w:b w:val="0"/>
+          <w:color w:val="262F38"/>
+          <w:sz w:val="17"/>
         </w:rPr>
         <w:t>Board Member - National Blood Operations Oversight (2021-2024), appointed by Egypt's Minister of Health: oversaw digital governance, data integrity, and technology standards for the national blood-supply system.</w:t>
       </w:r>
     </w:p>
     <w:p>
       <w:pPr>
-        <w:spacing w:before="0" w:after="24" w:line="245" w:lineRule="auto"/>
-        <w:ind w:left="202" w:hanging="144"/>
-        <w:keepLines/>
+        <w:keepNext w:val="0"/>
+        <w:pageBreakBefore w:val="0"/>
+        <w:spacing w:before="0" w:after="44" w:line="240" w:lineRule="auto"/>
+        <w:ind w:left="230" w:hanging="158"/>
       </w:pPr>
       <w:r>
         <w:rPr>
           <w:rFonts w:ascii="Arial" w:hAnsi="Arial" w:eastAsia="Arial"/>
-          <w:b/>
-          <w:color w:val="C49A45"/>
-          <w:sz w:val="16"/>
+          <w:b w:val="0"/>
+          <w:color w:val="262F38"/>
+          <w:sz w:val="17"/>
         </w:rPr>
         <w:t xml:space="preserve">• </w:t>
       </w:r>
       <w:r>
         <w:rPr>
           <w:rFonts w:ascii="Arial" w:hAnsi="Arial" w:eastAsia="Arial"/>
-          <w:color w:val="111111"/>
-          <w:sz w:val="16"/>
+          <w:b w:val="0"/>
+          <w:color w:val="262F38"/>
+          <w:sz w:val="17"/>
         </w:rPr>
         <w:t>Governance Lead - National Pharmaceutical Track &amp; Trace Program (2021-2024): shaped the vision, governance framework, compliance model, stakeholder coordination, and technology roadmap across UPA, EDA, and Ministry of Health stakeholders.</w:t>
       </w:r>
@@ -1056,102 +1123,111 @@
     <w:p>
       <w:pPr>
         <w:keepNext/>
-        <w:spacing w:before="120" w:after="40" w:line="245" w:lineRule="auto"/>
+        <w:spacing w:before="88" w:after="60" w:line="240" w:lineRule="auto"/>
+        <w:pageBreakBefore w:val="0"/>
         <w:pBdr>
-          <w:bottom w:val="single" w:sz="7" w:space="3" w:color="C49A45"/>
+          <w:bottom w:val="single" w:sz="5" w:space="3" w:color="B8C5D1"/>
         </w:pBdr>
-        <w:keepLines/>
       </w:pPr>
       <w:r>
         <w:rPr>
-          <w:rFonts w:ascii="Aptos Display" w:hAnsi="Aptos Display" w:eastAsia="Arial"/>
+          <w:rFonts w:ascii="Arial" w:hAnsi="Arial" w:eastAsia="Arial"/>
           <w:b/>
-          <w:color w:val="17324D"/>
-          <w:sz w:val="18"/>
+          <w:color w:val="183B56"/>
+          <w:sz w:val="19"/>
         </w:rPr>
         <w:t>SELECTED ENTERPRISE PLATFORMS &amp; PROGRAMS</w:t>
       </w:r>
     </w:p>
     <w:p>
       <w:pPr>
-        <w:keepNext/>
-        <w:spacing w:before="20" w:after="40" w:line="245" w:lineRule="auto"/>
+        <w:keepNext w:val="0"/>
+        <w:pageBreakBefore w:val="0"/>
+        <w:spacing w:before="20" w:after="41" w:line="240" w:lineRule="auto"/>
       </w:pPr>
       <w:r>
         <w:rPr>
           <w:rFonts w:ascii="Arial" w:hAnsi="Arial" w:eastAsia="Arial"/>
           <w:b/>
           <w:color w:val="123B4A"/>
-          <w:sz w:val="16"/>
+          <w:sz w:val="17"/>
         </w:rPr>
         <w:t>UPA National Procurement &amp; MediQ Ecosystem</w:t>
       </w:r>
     </w:p>
     <w:p>
       <w:pPr>
-        <w:spacing w:before="0" w:after="40" w:line="245" w:lineRule="auto"/>
+        <w:keepNext w:val="0"/>
+        <w:pageBreakBefore w:val="0"/>
+        <w:spacing w:before="0" w:after="41" w:line="240" w:lineRule="auto"/>
       </w:pPr>
       <w:r>
         <w:rPr>
           <w:rFonts w:ascii="Arial" w:hAnsi="Arial" w:eastAsia="Arial"/>
           <w:color w:val="111111"/>
-          <w:sz w:val="16"/>
+          <w:sz w:val="17"/>
         </w:rPr>
         <w:t>National-scale procurement, medical-supply and inventory/warehouse capabilities with configurable workflows, auditability, analytics/reporting, support services and enterprise integrations; core procurement operations run at ~1M transactions/month.</w:t>
       </w:r>
     </w:p>
     <w:p>
       <w:pPr>
-        <w:keepNext/>
-        <w:spacing w:before="20" w:after="40" w:line="245" w:lineRule="auto"/>
+        <w:keepNext w:val="0"/>
+        <w:pageBreakBefore w:val="0"/>
+        <w:spacing w:before="20" w:after="41" w:line="240" w:lineRule="auto"/>
       </w:pPr>
       <w:r>
         <w:rPr>
           <w:rFonts w:ascii="Arial" w:hAnsi="Arial" w:eastAsia="Arial"/>
           <w:b/>
           <w:color w:val="123B4A"/>
-          <w:sz w:val="16"/>
+          <w:sz w:val="17"/>
         </w:rPr>
         <w:t>National Pharmaceutical Track &amp; Trace</w:t>
       </w:r>
     </w:p>
     <w:p>
       <w:pPr>
-        <w:spacing w:before="0" w:after="40" w:line="245" w:lineRule="auto"/>
+        <w:keepNext w:val="0"/>
+        <w:pageBreakBefore w:val="0"/>
+        <w:spacing w:before="0" w:after="41" w:line="240" w:lineRule="auto"/>
       </w:pPr>
       <w:r>
         <w:rPr>
           <w:rFonts w:ascii="Arial" w:hAnsi="Arial" w:eastAsia="Arial"/>
           <w:color w:val="111111"/>
-          <w:sz w:val="16"/>
+          <w:sz w:val="17"/>
         </w:rPr>
         <w:t>Governance and technology roadmap across UPA, Egyptian Drug Authority and Ministry of Health stakeholders, focused on compliance, interoperability, data integrity and coordinated national delivery.</w:t>
       </w:r>
     </w:p>
     <w:p>
       <w:pPr>
-        <w:keepNext/>
-        <w:spacing w:before="20" w:after="40" w:line="245" w:lineRule="auto"/>
+        <w:keepNext w:val="0"/>
+        <w:pageBreakBefore w:val="0"/>
+        <w:spacing w:before="20" w:after="41" w:line="240" w:lineRule="auto"/>
       </w:pPr>
       <w:r>
         <w:rPr>
           <w:rFonts w:ascii="Arial" w:hAnsi="Arial" w:eastAsia="Arial"/>
           <w:b/>
           <w:color w:val="123B4A"/>
-          <w:sz w:val="16"/>
+          <w:sz w:val="17"/>
         </w:rPr>
         <w:t>Oman Government Digital Platforms</w:t>
       </w:r>
     </w:p>
     <w:p>
       <w:pPr>
-        <w:spacing w:before="0" w:after="40" w:line="245" w:lineRule="auto"/>
+        <w:keepNext w:val="0"/>
+        <w:pageBreakBefore w:val="0"/>
+        <w:spacing w:before="0" w:after="41" w:line="240" w:lineRule="auto"/>
       </w:pPr>
       <w:r>
         <w:rPr>
           <w:rFonts w:ascii="Arial" w:hAnsi="Arial" w:eastAsia="Arial"/>
           <w:color w:val="111111"/>
-          <w:sz w:val="16"/>
+          <w:sz w:val="17"/>
         </w:rPr>
         <w:t>Led delivery and contributed hands-on across 15+ platforms including the ~1M-user National Educational Portal, Maktabi/Morasalat Electronic Correspondence, Sultan Qaboos Award-winning Ministry of Education Recruitment System, International Schools, Crisis/Asset Management, Al Wahat Club (Royal Court Affairs) and Ministry of Agriculture delivery.</w:t>
       </w:r>
@@ -1159,140 +1235,187 @@
     <w:p>
       <w:pPr>
         <w:keepNext/>
-        <w:spacing w:before="120" w:after="40" w:line="245" w:lineRule="auto"/>
+        <w:spacing w:before="88" w:after="60" w:line="240" w:lineRule="auto"/>
+        <w:pageBreakBefore w:val="0"/>
         <w:pBdr>
-          <w:bottom w:val="single" w:sz="7" w:space="3" w:color="C49A45"/>
+          <w:bottom w:val="single" w:sz="5" w:space="3" w:color="B8C5D1"/>
         </w:pBdr>
-        <w:keepLines/>
       </w:pPr>
       <w:r>
         <w:rPr>
-          <w:rFonts w:ascii="Aptos Display" w:hAnsi="Aptos Display" w:eastAsia="Arial"/>
+          <w:rFonts w:ascii="Arial" w:hAnsi="Arial" w:eastAsia="Arial"/>
           <w:b/>
-          <w:color w:val="17324D"/>
-          <w:sz w:val="18"/>
+          <w:color w:val="183B56"/>
+          <w:sz w:val="19"/>
         </w:rPr>
         <w:t>TECHNICAL &amp; MANAGEMENT CAPABILITIES</w:t>
       </w:r>
     </w:p>
     <w:p>
       <w:pPr>
-        <w:spacing w:before="0" w:after="40" w:line="245" w:lineRule="auto"/>
+        <w:keepNext w:val="0"/>
+        <w:pageBreakBefore w:val="0"/>
+        <w:spacing w:before="0" w:after="41" w:line="240" w:lineRule="auto"/>
+      </w:pPr>
+      <w:r>
+        <w:rPr>
+          <w:rFonts w:ascii="Arial" w:hAnsi="Arial"/>
+          <w:b/>
+          <w:color w:val="183B56"/>
+          <w:sz w:val="17"/>
+        </w:rPr>
+        <w:t xml:space="preserve">Executive &amp; Governance: </w:t>
+      </w:r>
+      <w:r>
+        <w:rPr>
+          <w:rFonts w:ascii="Arial" w:hAnsi="Arial"/>
+          <w:b w:val="0"/>
+          <w:color w:val="262F38"/>
+          <w:sz w:val="17"/>
+        </w:rPr>
+        <w:t>Technology Strategy, IT Operating Model, Organization Design, Portfolio/Roadmaps, Executive Stakeholders, Third-Party Coordination, Service Governance, Risk/Controls, Business Continuity/DR Oversight</w:t>
+      </w:r>
+    </w:p>
+    <w:p>
+      <w:pPr>
+        <w:keepNext w:val="0"/>
+        <w:pageBreakBefore w:val="0"/>
+        <w:spacing w:before="0" w:after="41" w:line="240" w:lineRule="auto"/>
+      </w:pPr>
+      <w:r>
+        <w:rPr>
+          <w:rFonts w:ascii="Arial" w:hAnsi="Arial"/>
+          <w:b/>
+          <w:color w:val="183B56"/>
+          <w:sz w:val="17"/>
+        </w:rPr>
+        <w:t xml:space="preserve">Architecture &amp; Engineering: </w:t>
+      </w:r>
+      <w:r>
+        <w:rPr>
+          <w:rFonts w:ascii="Arial" w:hAnsi="Arial"/>
+          <w:b w:val="0"/>
+          <w:color w:val="262F38"/>
+          <w:sz w:val="17"/>
+        </w:rPr>
+        <w:t>Enterprise/Solution Architecture, API-First &amp; Integration Architecture, Multi-Tenant/Configurable Platforms, C#, .NET / ASP.NET Web Forms/Core/Web API, JavaScript, SQL</w:t>
+      </w:r>
+    </w:p>
+    <w:p>
+      <w:pPr>
+        <w:keepNext w:val="0"/>
+        <w:pageBreakBefore w:val="0"/>
+        <w:spacing w:before="0" w:after="41" w:line="240" w:lineRule="auto"/>
+      </w:pPr>
+      <w:r>
+        <w:rPr>
+          <w:rFonts w:ascii="Arial" w:hAnsi="Arial"/>
+          <w:b/>
+          <w:color w:val="183B56"/>
+          <w:sz w:val="17"/>
+        </w:rPr>
+        <w:t xml:space="preserve">Enterprise Platforms &amp; Operations: </w:t>
+      </w:r>
+      <w:r>
+        <w:rPr>
+          <w:rFonts w:ascii="Arial" w:hAnsi="Arial"/>
+          <w:b w:val="0"/>
+          <w:color w:val="262F38"/>
+          <w:sz w:val="17"/>
+        </w:rPr>
+        <w:t>E-Procurement, Workflow/BPM, CMS/Electronic Publishing, DMS/Archiving, RBAC/Audit, Technical Support &amp; Customer Service, Service Desk/Call Center, SLA/Incident/RCA, Training/Adoption, Data Governance &amp; Reporting Architecture</w:t>
+      </w:r>
+    </w:p>
+    <w:p>
+      <w:pPr>
+        <w:keepNext w:val="0"/>
+        <w:pageBreakBefore w:val="0"/>
+        <w:spacing w:before="0" w:after="41" w:line="240" w:lineRule="auto"/>
+      </w:pPr>
+      <w:r>
+        <w:rPr>
+          <w:rFonts w:ascii="Arial" w:hAnsi="Arial"/>
+          <w:b/>
+          <w:color w:val="183B56"/>
+          <w:sz w:val="17"/>
+        </w:rPr>
+        <w:t xml:space="preserve">Tools, Data &amp; AI: </w:t>
+      </w:r>
+      <w:r>
+        <w:rPr>
+          <w:rFonts w:ascii="Arial" w:hAnsi="Arial"/>
+          <w:b w:val="0"/>
+          <w:color w:val="262F38"/>
+          <w:sz w:val="17"/>
+        </w:rPr>
+        <w:t>PostgreSQL, SQL Server, MySQL, Redis, Git/TFS, Jenkins, Postman, Swagger/OpenAPI, Visual Studio/VS Code, Applied AI &amp; Automation, AI-Assisted Engineering &amp; Analysis, Agentic Workflows, Enterprise AI Governance</w:t>
+      </w:r>
+    </w:p>
+    <w:p>
+      <w:pPr>
+        <w:keepNext/>
+        <w:spacing w:before="88" w:after="60" w:line="240" w:lineRule="auto"/>
+        <w:pageBreakBefore w:val="0"/>
+        <w:pBdr>
+          <w:bottom w:val="single" w:sz="5" w:space="3" w:color="B8C5D1"/>
+        </w:pBdr>
       </w:pPr>
       <w:r>
         <w:rPr>
           <w:rFonts w:ascii="Arial" w:hAnsi="Arial" w:eastAsia="Arial"/>
           <w:b/>
-          <w:color w:val="123B4A"/>
-          <w:sz w:val="16"/>
-        </w:rPr>
-        <w:t>Executive &amp; Governance: Technology Strategy, IT Operating Model, Portfolio/Roadmaps, Executive Stakeholders, Service Governance, Risk/Controls, Business Continuity/DR Oversight</w:t>
-      </w:r>
-    </w:p>
-    <w:p>
-      <w:pPr>
-        <w:spacing w:before="0" w:after="40" w:line="245" w:lineRule="auto"/>
-      </w:pPr>
-      <w:r>
-        <w:rPr>
-          <w:rFonts w:ascii="Arial" w:hAnsi="Arial" w:eastAsia="Arial"/>
-          <w:b/>
-          <w:color w:val="123B4A"/>
-          <w:sz w:val="16"/>
-        </w:rPr>
-        <w:t>Architecture &amp; Engineering: Enterprise/Solution Architecture, API &amp; Integration Architecture, Configurable Platforms, C#, .NET/ASP.NET, JavaScript, React, Node.js, GraphQL</w:t>
-      </w:r>
-    </w:p>
-    <w:p>
-      <w:pPr>
-        <w:spacing w:before="0" w:after="40" w:line="245" w:lineRule="auto"/>
-      </w:pPr>
-      <w:r>
-        <w:rPr>
-          <w:rFonts w:ascii="Arial" w:hAnsi="Arial" w:eastAsia="Arial"/>
-          <w:b/>
-          <w:color w:val="123B4A"/>
-          <w:sz w:val="16"/>
-        </w:rPr>
-        <w:t>Platforms &amp; Operations: E-Procurement, Workflow/BPM, CMS/DMS, RBAC/Audit, Microsoft 365, Endpoint/Device Management, Patch/Vulnerability Management, Technical Support &amp; Customer Service, Service Desk, SLA/Incident/RCA, Training/Adoption</w:t>
-      </w:r>
-      <w:r>
-        <w:rPr>
-          <w:rFonts w:ascii="Arial" w:hAnsi="Arial" w:eastAsia="Arial"/>
-          <w:color w:val="111111"/>
-          <w:sz w:val="16"/>
-        </w:rPr>
-      </w:r>
-    </w:p>
-    <w:p>
-      <w:pPr>
-        <w:spacing w:before="0" w:after="40" w:line="245" w:lineRule="auto"/>
-      </w:pPr>
-      <w:r>
-        <w:rPr>
-          <w:rFonts w:ascii="Arial" w:hAnsi="Arial" w:eastAsia="Arial"/>
-          <w:b/>
-          <w:color w:val="123B4A"/>
-          <w:sz w:val="16"/>
-        </w:rPr>
-        <w:t>Data, Tooling &amp; AI: SQL Server, PostgreSQL, MySQL, Redis, Git/TFS, Jenkins, Docker, Postman/Swagger, Visual Studio/VS Code, Rider, DataGrip, Applied AI &amp; Enterprise AI Governance</w:t>
-      </w:r>
-      <w:r>
-        <w:rPr>
-          <w:rFonts w:ascii="Arial" w:hAnsi="Arial" w:eastAsia="Arial"/>
-          <w:color w:val="111111"/>
-          <w:sz w:val="16"/>
-        </w:rPr>
-      </w:r>
-    </w:p>
-    <w:p>
-      <w:pPr>
-        <w:keepNext/>
-        <w:spacing w:before="120" w:after="40" w:line="245" w:lineRule="auto"/>
-        <w:pBdr>
-          <w:bottom w:val="single" w:sz="7" w:space="3" w:color="C49A45"/>
-        </w:pBdr>
-        <w:keepLines/>
-      </w:pPr>
-      <w:r>
-        <w:rPr>
-          <w:rFonts w:ascii="Aptos Display" w:hAnsi="Aptos Display" w:eastAsia="Arial"/>
-          <w:b/>
-          <w:color w:val="17324D"/>
-          <w:sz w:val="18"/>
+          <w:color w:val="183B56"/>
+          <w:sz w:val="19"/>
         </w:rPr>
         <w:t>EDUCATION &amp; LANGUAGES</w:t>
       </w:r>
     </w:p>
     <w:p>
       <w:pPr>
-        <w:spacing w:before="0" w:after="40" w:line="245" w:lineRule="auto"/>
+        <w:keepNext/>
+        <w:pageBreakBefore w:val="0"/>
+        <w:spacing w:before="72" w:after="16" w:line="247" w:lineRule="auto"/>
       </w:pPr>
       <w:r>
         <w:rPr>
-          <w:sz w:val="16"/>
+          <w:rFonts w:ascii="Arial" w:hAnsi="Arial"/>
+          <w:b/>
+          <w:color w:val="183B56"/>
+          <w:sz w:val="17"/>
         </w:rPr>
-        <w:t>Education: B.Sc. in Computer Science, Faculty of Computers &amp; Informatics, Zagazig University | 2003-2007</w:t>
+        <w:t xml:space="preserve">Education: </w:t>
+      </w:r>
+      <w:r>
+        <w:rPr>
+          <w:rFonts w:ascii="Arial" w:hAnsi="Arial"/>
+          <w:b w:val="0"/>
+          <w:color w:val="262F38"/>
+          <w:sz w:val="17"/>
+        </w:rPr>
+        <w:t>B.Sc. in Computer Science, Faculty of Computers &amp; Informatics, Zagazig University | 2003-2007</w:t>
       </w:r>
     </w:p>
     <w:p>
       <w:pPr>
-        <w:spacing w:before="0" w:after="40" w:line="245" w:lineRule="auto"/>
+        <w:keepNext w:val="0"/>
+        <w:pageBreakBefore w:val="0"/>
+        <w:spacing w:before="0" w:after="41" w:line="247" w:lineRule="auto"/>
       </w:pPr>
       <w:r>
         <w:rPr>
-          <w:rFonts w:ascii="Arial" w:hAnsi="Arial" w:eastAsia="Arial"/>
+          <w:rFonts w:ascii="Arial" w:hAnsi="Arial"/>
           <w:b/>
-          <w:color w:val="123B4A"/>
-          <w:sz w:val="16"/>
+          <w:color w:val="183B56"/>
+          <w:sz w:val="17"/>
         </w:rPr>
         <w:t xml:space="preserve">Languages: </w:t>
       </w:r>
       <w:r>
         <w:rPr>
-          <w:rFonts w:ascii="Arial" w:hAnsi="Arial" w:eastAsia="Arial"/>
-          <w:color w:val="111111"/>
-          <w:sz w:val="16"/>
+          <w:rFonts w:ascii="Arial" w:hAnsi="Arial"/>
+          <w:b w:val="0"/>
+          <w:color w:val="262F38"/>
+          <w:sz w:val="17"/>
         </w:rPr>
         <w:t>Arabic (Native) | English (Professional Working Proficiency)</w:t>
       </w:r>
@@ -1300,7 +1423,7 @@
     <w:sectPr>
       <w:footerReference w:type="default" r:id="rId9"/>
       <w:pgSz w:w="12240" w:h="15840"/>
-      <w:pgMar w:top="691" w:right="893" w:bottom="691" w:left="893" w:header="720" w:footer="720" w:gutter="0"/>
+      <w:pgMar w:top="634" w:right="922" w:bottom="634" w:left="922" w:header="720" w:footer="331" w:gutter="0"/>
       <w:cols w:space="720"/>
       <w:docGrid w:linePitch="360"/>
     </w:sectPr>
@@ -1318,11 +1441,18 @@
     </w:pPr>
     <w:r>
       <w:rPr>
-        <w:rFonts w:ascii="Aptos" w:hAnsi="Aptos"/>
-        <w:color w:val="17324D"/>
+        <w:rFonts w:ascii="Arial" w:hAnsi="Arial"/>
+        <w:color w:val="6E7680"/>
         <w:sz w:val="13"/>
       </w:rPr>
-      <w:t>Mahmoud Salama | CTO &amp; IT Director | 2026</w:t>
+    </w:r>
+    <w:r>
+      <w:rPr>
+        <w:rFonts w:ascii="Arial" w:hAnsi="Arial"/>
+        <w:color w:val="6E7680"/>
+        <w:sz w:val="13"/>
+      </w:rPr>
+      <w:t>MAHMOUD SALAMA</w:t>
     </w:r>
   </w:p>
 </w:ftr>
@@ -1692,11 +1822,11 @@
     <w:qFormat/>
     <w:rsid w:val="00FC693F"/>
     <w:pPr>
-      <w:spacing w:after="0" w:line="240" w:lineRule="auto"/>
+      <w:spacing w:after="41" w:line="242" w:lineRule="auto"/>
     </w:pPr>
     <w:rPr>
-      <w:rFonts w:ascii="Aptos" w:hAnsi="Aptos"/>
-      <w:color w:val="26323A"/>
+      <w:rFonts w:ascii="Arial" w:hAnsi="Arial"/>
+      <w:color w:val="262F38"/>
       <w:sz w:val="17"/>
     </w:rPr>
   </w:style>

</xml_diff>